<commit_message>
minor changes on Report
</commit_message>
<xml_diff>
--- a/Report/ToTheTheath.docx
+++ b/Report/ToTheTheath.docx
@@ -1,8 +1,1904 @@
 
 <file path=word/document.xml><?xml version="1.0" encoding="utf-8"?>
 <w:document xmlns:wpc="http://schemas.microsoft.com/office/word/2010/wordprocessingCanvas" xmlns:cx="http://schemas.microsoft.com/office/drawing/2014/chartex" xmlns:cx1="http://schemas.microsoft.com/office/drawing/2015/9/8/chartex" xmlns:cx2="http://schemas.microsoft.com/office/drawing/2015/10/21/chartex" xmlns:cx3="http://schemas.microsoft.com/office/drawing/2016/5/9/chartex" xmlns:cx4="http://schemas.microsoft.com/office/drawing/2016/5/10/chartex" xmlns:cx5="http://schemas.microsoft.com/office/drawing/2016/5/11/chartex" xmlns:cx6="http://schemas.microsoft.com/office/drawing/2016/5/12/chartex" xmlns:cx7="http://schemas.microsoft.com/office/drawing/2016/5/13/chartex" xmlns:cx8="http://schemas.microsoft.com/office/drawing/2016/5/14/chartex" xmlns:mc="http://schemas.openxmlformats.org/markup-compatibility/2006" xmlns:aink="http://schemas.microsoft.com/office/drawing/2016/ink" xmlns:am3d="http://schemas.microsoft.com/office/drawing/2017/model3d" xmlns:o="urn:schemas-microsoft-com:office:office" xmlns:r="http://schemas.openxmlformats.org/officeDocument/2006/relationships" xmlns:m="http://schemas.openxmlformats.org/officeDocument/2006/math" xmlns:v="urn:schemas-microsoft-com:vml" xmlns:wp14="http://schemas.microsoft.com/office/word/2010/wordprocessingDrawing" xmlns:wp="http://schemas.openxmlformats.org/drawingml/2006/wordprocessingDrawing" xmlns:w10="urn:schemas-microsoft-com:office:word" xmlns:w="http://schemas.openxmlformats.org/wordprocessingml/2006/main" xmlns:w14="http://schemas.microsoft.com/office/word/2010/wordml" xmlns:w15="http://schemas.microsoft.com/office/word/2012/wordml" xmlns:w16cex="http://schemas.microsoft.com/office/word/2018/wordml/cex" xmlns:w16cid="http://schemas.microsoft.com/office/word/2016/wordml/cid" xmlns:w16="http://schemas.microsoft.com/office/word/2018/wordml" xmlns:w16sdtdh="http://schemas.microsoft.com/office/word/2020/wordml/sdtdatahash" xmlns:w16se="http://schemas.microsoft.com/office/word/2015/wordml/symex" xmlns:wpg="http://schemas.microsoft.com/office/word/2010/wordprocessingGroup" xmlns:wpi="http://schemas.microsoft.com/office/word/2010/wordprocessingInk" xmlns:wne="http://schemas.microsoft.com/office/word/2006/wordml" xmlns:wps="http://schemas.microsoft.com/office/word/2010/wordprocessingShape" mc:Ignorable="w14 w15 w16se w16cid w16 w16cex w16sdtdh wp14">
+  <w:background w:color="000000" w:themeColor="text1"/>
   <w:body>
-    <w:p/>
+    <w:p>
+      <w:pPr>
+        <w:pStyle w:val="Heading1"/>
+        <w:bidi/>
+        <w:rPr>
+          <w:rtl/>
+          <w:lang w:bidi="fa-IR"/>
+        </w:rPr>
+      </w:pPr>
+      <w:r>
+        <w:rPr>
+          <w:rFonts w:hint="cs"/>
+          <w:rtl/>
+          <w:lang w:bidi="fa-IR"/>
+        </w:rPr>
+        <w:t xml:space="preserve">فایل </w:t>
+      </w:r>
+      <w:r>
+        <w:rPr>
+          <w:lang w:bidi="fa-IR"/>
+        </w:rPr>
+        <w:t>Main</w:t>
+      </w:r>
+    </w:p>
+    <w:p>
+      <w:pPr>
+        <w:bidi/>
+        <w:rPr>
+          <w:rFonts w:hint="cs"/>
+          <w:rtl/>
+          <w:lang w:bidi="fa-IR"/>
+        </w:rPr>
+      </w:pPr>
+      <w:r>
+        <w:rPr>
+          <w:rFonts w:hint="cs"/>
+          <w:rtl/>
+          <w:lang w:bidi="fa-IR"/>
+        </w:rPr>
+        <w:t xml:space="preserve">عملکرد: وظیفه اجرای بخش </w:t>
+      </w:r>
+      <w:r>
+        <w:rPr>
+          <w:lang w:bidi="fa-IR"/>
+        </w:rPr>
+        <w:t>client</w:t>
+      </w:r>
+      <w:r>
+        <w:rPr>
+          <w:rFonts w:hint="cs"/>
+          <w:rtl/>
+          <w:lang w:bidi="fa-IR"/>
+        </w:rPr>
+        <w:t xml:space="preserve"> بازی را به عهده داشته و با </w:t>
+      </w:r>
+      <w:r>
+        <w:rPr>
+          <w:lang w:bidi="fa-IR"/>
+        </w:rPr>
+        <w:t>server</w:t>
+      </w:r>
+      <w:r>
+        <w:rPr>
+          <w:rFonts w:hint="cs"/>
+          <w:rtl/>
+          <w:lang w:bidi="fa-IR"/>
+        </w:rPr>
+        <w:t xml:space="preserve"> ارتباط برقرار می‌کند. ابتدا یک سوکت با نام </w:t>
+      </w:r>
+      <w:proofErr w:type="spellStart"/>
+      <w:r>
+        <w:rPr>
+          <w:lang w:bidi="fa-IR"/>
+        </w:rPr>
+        <w:t>sc</w:t>
+      </w:r>
+      <w:proofErr w:type="spellEnd"/>
+      <w:r>
+        <w:rPr>
+          <w:rFonts w:hint="cs"/>
+          <w:rtl/>
+          <w:lang w:bidi="fa-IR"/>
+        </w:rPr>
+        <w:t xml:space="preserve"> ایجاد شده، سپس طول و عرض صفحه اجرایی بازی تنظیم گردیده، با مشخص کردن رنگ پس زمینه، عنوان پنجره اجرایی، آدرس و پورت سوکت، </w:t>
+      </w:r>
+      <w:r>
+        <w:rPr>
+          <w:lang w:bidi="fa-IR"/>
+        </w:rPr>
+        <w:t>FPS</w:t>
+      </w:r>
+      <w:r>
+        <w:rPr>
+          <w:rFonts w:hint="cs"/>
+          <w:rtl/>
+          <w:lang w:bidi="fa-IR"/>
+        </w:rPr>
+        <w:t xml:space="preserve"> و صحنه ابتدایی (مقدار </w:t>
+      </w:r>
+      <w:r>
+        <w:rPr>
+          <w:lang w:bidi="fa-IR"/>
+        </w:rPr>
+        <w:t>SCENE</w:t>
+      </w:r>
+      <w:r>
+        <w:rPr>
+          <w:rFonts w:hint="cs"/>
+          <w:rtl/>
+          <w:lang w:bidi="fa-IR"/>
+        </w:rPr>
+        <w:t>)</w:t>
+      </w:r>
+      <w:r>
+        <w:rPr>
+          <w:rFonts w:hint="cs"/>
+          <w:rtl/>
+          <w:lang w:bidi="fa-IR"/>
+        </w:rPr>
+        <w:t xml:space="preserve"> به اجرای بازی می‌پردازد.</w:t>
+      </w:r>
+    </w:p>
+    <w:p>
+      <w:pPr>
+        <w:pStyle w:val="Heading2"/>
+        <w:bidi/>
+        <w:rPr>
+          <w:rtl/>
+          <w:lang w:bidi="fa-IR"/>
+        </w:rPr>
+      </w:pPr>
+      <w:r>
+        <w:rPr>
+          <w:rFonts w:hint="cs"/>
+          <w:rtl/>
+          <w:lang w:bidi="fa-IR"/>
+        </w:rPr>
+        <w:t xml:space="preserve">تابع </w:t>
+      </w:r>
+      <w:proofErr w:type="spellStart"/>
+      <w:r>
+        <w:rPr>
+          <w:lang w:bidi="fa-IR"/>
+        </w:rPr>
+        <w:t>change_scene</w:t>
+      </w:r>
+      <w:proofErr w:type="spellEnd"/>
+    </w:p>
+    <w:p>
+      <w:pPr>
+        <w:bidi/>
+        <w:rPr>
+          <w:rtl/>
+          <w:lang w:bidi="fa-IR"/>
+        </w:rPr>
+      </w:pPr>
+      <w:r>
+        <w:rPr>
+          <w:rFonts w:hint="cs"/>
+          <w:rtl/>
+          <w:lang w:bidi="fa-IR"/>
+        </w:rPr>
+        <w:t xml:space="preserve">عملکرد: با دریافت یک </w:t>
+      </w:r>
+      <w:r>
+        <w:rPr>
+          <w:lang w:bidi="fa-IR"/>
+        </w:rPr>
+        <w:t>scene</w:t>
+      </w:r>
+      <w:r>
+        <w:rPr>
+          <w:rFonts w:hint="cs"/>
+          <w:rtl/>
+          <w:lang w:bidi="fa-IR"/>
+        </w:rPr>
+        <w:t xml:space="preserve"> از نوع </w:t>
+      </w:r>
+      <w:r>
+        <w:rPr>
+          <w:lang w:bidi="fa-IR"/>
+        </w:rPr>
+        <w:t>str</w:t>
+      </w:r>
+      <w:r>
+        <w:rPr>
+          <w:rFonts w:hint="cs"/>
+          <w:rtl/>
+          <w:lang w:bidi="fa-IR"/>
+        </w:rPr>
+        <w:t xml:space="preserve">، متغیر </w:t>
+      </w:r>
+      <w:r>
+        <w:rPr>
+          <w:lang w:bidi="fa-IR"/>
+        </w:rPr>
+        <w:t>SCENE</w:t>
+      </w:r>
+      <w:r>
+        <w:rPr>
+          <w:rFonts w:hint="cs"/>
+          <w:rtl/>
+          <w:lang w:bidi="fa-IR"/>
+        </w:rPr>
+        <w:t xml:space="preserve"> را در حین اجرای بازی عوض می‌کند. این متغیر در ادامه توسط تابع </w:t>
+      </w:r>
+      <w:proofErr w:type="spellStart"/>
+      <w:r>
+        <w:rPr>
+          <w:lang w:bidi="fa-IR"/>
+        </w:rPr>
+        <w:t>handle_scences</w:t>
+      </w:r>
+      <w:proofErr w:type="spellEnd"/>
+      <w:r>
+        <w:rPr>
+          <w:rFonts w:hint="cs"/>
+          <w:rtl/>
+          <w:lang w:bidi="fa-IR"/>
+        </w:rPr>
+        <w:t xml:space="preserve"> بررسی شده و موجب تعویض صحنه بازی خواهد شد. لا</w:t>
+      </w:r>
+      <w:r>
+        <w:rPr>
+          <w:rFonts w:hint="cs"/>
+          <w:rtl/>
+          <w:lang w:bidi="fa-IR"/>
+        </w:rPr>
+        <w:t xml:space="preserve">زم به ذکر است که مقدار اولیه این متغیر </w:t>
+      </w:r>
+      <w:r>
+        <w:rPr>
+          <w:lang w:bidi="fa-IR"/>
+        </w:rPr>
+        <w:t>connecting</w:t>
+      </w:r>
+      <w:r>
+        <w:rPr>
+          <w:rFonts w:hint="cs"/>
+          <w:rtl/>
+          <w:lang w:bidi="fa-IR"/>
+        </w:rPr>
+        <w:t xml:space="preserve"> تنظیم شده است تا پنجره مربوطه را در ابتدای اجرای بازی نمایش دهد.</w:t>
+      </w:r>
+    </w:p>
+    <w:p>
+      <w:pPr>
+        <w:pStyle w:val="Heading2"/>
+        <w:bidi/>
+        <w:rPr>
+          <w:lang w:bidi="fa-IR"/>
+        </w:rPr>
+      </w:pPr>
+      <w:r>
+        <w:rPr>
+          <w:rFonts w:hint="cs"/>
+          <w:rtl/>
+          <w:lang w:bidi="fa-IR"/>
+        </w:rPr>
+        <w:t xml:space="preserve">تابع </w:t>
+      </w:r>
+      <w:proofErr w:type="spellStart"/>
+      <w:r>
+        <w:rPr>
+          <w:lang w:bidi="fa-IR"/>
+        </w:rPr>
+        <w:t>change_background</w:t>
+      </w:r>
+      <w:proofErr w:type="spellEnd"/>
+    </w:p>
+    <w:p>
+      <w:pPr>
+        <w:bidi/>
+        <w:rPr>
+          <w:rtl/>
+          <w:lang w:bidi="fa-IR"/>
+        </w:rPr>
+      </w:pPr>
+      <w:r>
+        <w:rPr>
+          <w:rFonts w:hint="cs"/>
+          <w:rtl/>
+          <w:lang w:bidi="fa-IR"/>
+        </w:rPr>
+        <w:t xml:space="preserve">عملکرد: این تابع با گرفتن رنگ </w:t>
+      </w:r>
+      <w:r>
+        <w:rPr>
+          <w:lang w:bidi="fa-IR"/>
+        </w:rPr>
+        <w:t>background</w:t>
+      </w:r>
+      <w:r>
+        <w:rPr>
+          <w:rFonts w:hint="cs"/>
+          <w:rtl/>
+          <w:lang w:bidi="fa-IR"/>
+        </w:rPr>
+        <w:t xml:space="preserve"> و با توجه به مقدار متغیر </w:t>
+      </w:r>
+      <w:proofErr w:type="spellStart"/>
+      <w:r>
+        <w:rPr>
+          <w:lang w:bidi="fa-IR"/>
+        </w:rPr>
+        <w:t>light_theme</w:t>
+      </w:r>
+      <w:proofErr w:type="spellEnd"/>
+      <w:r>
+        <w:rPr>
+          <w:rFonts w:hint="cs"/>
+          <w:rtl/>
+          <w:lang w:bidi="fa-IR"/>
+        </w:rPr>
+        <w:t>، تم بازی را (که شامل رنگ فونت ها و دیگر المان ها می‌شود) رنگ بندی کلی بازی را بسته به کاراکتر انتخابی توسط کاربر تغییر میدهد</w:t>
+      </w:r>
+    </w:p>
+    <w:p>
+      <w:pPr>
+        <w:pStyle w:val="Heading2"/>
+        <w:bidi/>
+        <w:rPr>
+          <w:rtl/>
+          <w:lang w:bidi="fa-IR"/>
+        </w:rPr>
+      </w:pPr>
+      <w:r>
+        <w:rPr>
+          <w:rFonts w:hint="cs"/>
+          <w:rtl/>
+          <w:lang w:bidi="fa-IR"/>
+        </w:rPr>
+        <w:t xml:space="preserve">تابع </w:t>
+      </w:r>
+      <w:proofErr w:type="spellStart"/>
+      <w:r>
+        <w:rPr>
+          <w:lang w:bidi="fa-IR"/>
+        </w:rPr>
+        <w:t>connect_to_server</w:t>
+      </w:r>
+      <w:proofErr w:type="spellEnd"/>
+    </w:p>
+    <w:p>
+      <w:pPr>
+        <w:bidi/>
+        <w:rPr>
+          <w:rtl/>
+          <w:lang w:bidi="fa-IR"/>
+        </w:rPr>
+      </w:pPr>
+      <w:r>
+        <w:rPr>
+          <w:rFonts w:hint="cs"/>
+          <w:rtl/>
+          <w:lang w:bidi="fa-IR"/>
+        </w:rPr>
+        <w:t xml:space="preserve">عملکرد: از سوکتی که در ابتدا ساختیم استفاده کرده و به عنوان اولین پیام دریافتی از سرور، لیستی از دیکشنری های حاوی اطلاعات کاراکتر ها را دریافت کرده و آنها را در متغیر </w:t>
+      </w:r>
+      <w:r>
+        <w:rPr>
+          <w:lang w:bidi="fa-IR"/>
+        </w:rPr>
+        <w:t>characters</w:t>
+      </w:r>
+      <w:r>
+        <w:rPr>
+          <w:rFonts w:hint="cs"/>
+          <w:rtl/>
+          <w:lang w:bidi="fa-IR"/>
+        </w:rPr>
+        <w:t xml:space="preserve"> قرار می‌دهد</w:t>
+      </w:r>
+      <w:r>
+        <w:rPr>
+          <w:rFonts w:hint="cs"/>
+          <w:rtl/>
+          <w:lang w:bidi="fa-IR"/>
+        </w:rPr>
+        <w:t xml:space="preserve">. در سری پیام های بعدی به کمک تابع </w:t>
+      </w:r>
+      <w:proofErr w:type="spellStart"/>
+      <w:r>
+        <w:rPr>
+          <w:lang w:bidi="fa-IR"/>
+        </w:rPr>
+        <w:t>game_stat_reveiver</w:t>
+      </w:r>
+      <w:proofErr w:type="spellEnd"/>
+      <w:r>
+        <w:rPr>
+          <w:rFonts w:hint="cs"/>
+          <w:rtl/>
+          <w:lang w:bidi="fa-IR"/>
+        </w:rPr>
+        <w:t xml:space="preserve"> به بررسی حرکات بازیکنان خواهد پرداخت. در صورت دریافت ارور و عدم اتصال به سرور، 1 ثانیه صبر کرده و سپس دوباره تلاش می‌کند.</w:t>
+      </w:r>
+    </w:p>
+    <w:p>
+      <w:pPr>
+        <w:pStyle w:val="Heading2"/>
+        <w:bidi/>
+        <w:rPr>
+          <w:rtl/>
+          <w:lang w:bidi="fa-IR"/>
+        </w:rPr>
+      </w:pPr>
+      <w:r>
+        <w:rPr>
+          <w:rFonts w:hint="cs"/>
+          <w:rtl/>
+          <w:lang w:bidi="fa-IR"/>
+        </w:rPr>
+        <w:t xml:space="preserve">تابع </w:t>
+      </w:r>
+      <w:proofErr w:type="spellStart"/>
+      <w:r>
+        <w:rPr>
+          <w:lang w:bidi="fa-IR"/>
+        </w:rPr>
+        <w:t>game_stat_receiver</w:t>
+      </w:r>
+      <w:proofErr w:type="spellEnd"/>
+    </w:p>
+    <w:p>
+      <w:pPr>
+        <w:bidi/>
+        <w:rPr>
+          <w:rtl/>
+          <w:lang w:bidi="fa-IR"/>
+        </w:rPr>
+      </w:pPr>
+      <w:r>
+        <w:rPr>
+          <w:rFonts w:hint="cs"/>
+          <w:rtl/>
+          <w:lang w:bidi="fa-IR"/>
+        </w:rPr>
+        <w:t xml:space="preserve">منتظر پیام سرور بوده و بعد از </w:t>
+      </w:r>
+      <w:r>
+        <w:rPr>
+          <w:lang w:bidi="fa-IR"/>
+        </w:rPr>
+        <w:t>decode</w:t>
+      </w:r>
+      <w:r>
+        <w:rPr>
+          <w:rFonts w:hint="cs"/>
+          <w:rtl/>
+          <w:lang w:bidi="fa-IR"/>
+        </w:rPr>
+        <w:t xml:space="preserve"> کردن آن، به </w:t>
+      </w:r>
+      <w:r>
+        <w:rPr>
+          <w:lang w:bidi="fa-IR"/>
+        </w:rPr>
+        <w:t>handle</w:t>
+      </w:r>
+      <w:r>
+        <w:rPr>
+          <w:rFonts w:hint="cs"/>
+          <w:rtl/>
+          <w:lang w:bidi="fa-IR"/>
+        </w:rPr>
+        <w:t xml:space="preserve"> کردن پیام سرور توسط تابع </w:t>
+      </w:r>
+      <w:proofErr w:type="spellStart"/>
+      <w:r>
+        <w:rPr>
+          <w:lang w:bidi="fa-IR"/>
+        </w:rPr>
+        <w:t>handle_server_msg</w:t>
+      </w:r>
+      <w:proofErr w:type="spellEnd"/>
+      <w:r>
+        <w:rPr>
+          <w:rFonts w:hint="cs"/>
+          <w:rtl/>
+          <w:lang w:bidi="fa-IR"/>
+        </w:rPr>
+        <w:t xml:space="preserve"> می‌پردازد.</w:t>
+      </w:r>
+    </w:p>
+    <w:p>
+      <w:pPr>
+        <w:pStyle w:val="Heading2"/>
+        <w:bidi/>
+        <w:rPr>
+          <w:rtl/>
+          <w:lang w:bidi="fa-IR"/>
+        </w:rPr>
+      </w:pPr>
+      <w:r>
+        <w:rPr>
+          <w:rFonts w:hint="cs"/>
+          <w:rtl/>
+          <w:lang w:bidi="fa-IR"/>
+        </w:rPr>
+        <w:t xml:space="preserve">تابع </w:t>
+      </w:r>
+      <w:proofErr w:type="spellStart"/>
+      <w:r>
+        <w:rPr>
+          <w:lang w:bidi="fa-IR"/>
+        </w:rPr>
+        <w:t>handle_server_msg</w:t>
+      </w:r>
+      <w:proofErr w:type="spellEnd"/>
+    </w:p>
+    <w:p>
+      <w:pPr>
+        <w:bidi/>
+        <w:rPr>
+          <w:rtl/>
+          <w:lang w:bidi="fa-IR"/>
+        </w:rPr>
+      </w:pPr>
+      <w:r>
+        <w:rPr>
+          <w:rFonts w:hint="cs"/>
+          <w:rtl/>
+          <w:lang w:bidi="fa-IR"/>
+        </w:rPr>
+        <w:t xml:space="preserve">پیام های ارسالی توسط سرور به صورت دیکشنری هستند و با توجه به </w:t>
+      </w:r>
+      <w:r>
+        <w:rPr>
+          <w:lang w:bidi="fa-IR"/>
+        </w:rPr>
+        <w:t>header</w:t>
+      </w:r>
+      <w:r>
+        <w:rPr>
+          <w:rFonts w:hint="cs"/>
+          <w:rtl/>
+          <w:lang w:bidi="fa-IR"/>
+        </w:rPr>
+        <w:t xml:space="preserve"> شان، به دسته های زیر تقسیم می‌شوند:</w:t>
+      </w:r>
+    </w:p>
+    <w:p>
+      <w:pPr>
+        <w:pStyle w:val="ListParagraph"/>
+        <w:numPr>
+          <w:ilvl w:val="0"/>
+          <w:numId w:val="1"/>
+        </w:numPr>
+        <w:bidi/>
+        <w:rPr>
+          <w:lang w:bidi="fa-IR"/>
+        </w:rPr>
+      </w:pPr>
+      <w:proofErr w:type="spellStart"/>
+      <w:r>
+        <w:rPr>
+          <w:lang w:bidi="fa-IR"/>
+        </w:rPr>
+        <w:t>Namechosed</w:t>
+      </w:r>
+      <w:proofErr w:type="spellEnd"/>
+      <w:r>
+        <w:rPr>
+          <w:rFonts w:hint="cs"/>
+          <w:rtl/>
+          <w:lang w:bidi="fa-IR"/>
+        </w:rPr>
+        <w:t xml:space="preserve">: حریف کاراکتر خود را انتخاب کرده است، که در متغیر </w:t>
+      </w:r>
+      <w:r>
+        <w:rPr>
+          <w:lang w:bidi="fa-IR"/>
+        </w:rPr>
+        <w:t>enemy</w:t>
+      </w:r>
+      <w:r>
+        <w:rPr>
+          <w:rFonts w:hint="cs"/>
+          <w:rtl/>
+          <w:lang w:bidi="fa-IR"/>
+        </w:rPr>
+        <w:t xml:space="preserve"> ذخیره خواهد شد.</w:t>
+      </w:r>
+    </w:p>
+    <w:p>
+      <w:pPr>
+        <w:pStyle w:val="ListParagraph"/>
+        <w:numPr>
+          <w:ilvl w:val="0"/>
+          <w:numId w:val="1"/>
+        </w:numPr>
+        <w:bidi/>
+        <w:rPr>
+          <w:lang w:bidi="fa-IR"/>
+        </w:rPr>
+      </w:pPr>
+      <w:proofErr w:type="spellStart"/>
+      <w:r>
+        <w:rPr>
+          <w:lang w:bidi="fa-IR"/>
+        </w:rPr>
+        <w:t>Change_stat</w:t>
+      </w:r>
+      <w:proofErr w:type="spellEnd"/>
+      <w:r>
+        <w:rPr>
+          <w:rFonts w:hint="cs"/>
+          <w:rtl/>
+          <w:lang w:bidi="fa-IR"/>
+        </w:rPr>
+        <w:t xml:space="preserve">: میزان </w:t>
+      </w:r>
+      <w:r>
+        <w:rPr>
+          <w:lang w:bidi="fa-IR"/>
+        </w:rPr>
+        <w:t>health</w:t>
+      </w:r>
+      <w:r>
+        <w:rPr>
+          <w:rFonts w:hint="cs"/>
+          <w:rtl/>
+          <w:lang w:bidi="fa-IR"/>
+        </w:rPr>
+        <w:t xml:space="preserve"> یا </w:t>
+      </w:r>
+      <w:r>
+        <w:rPr>
+          <w:lang w:bidi="fa-IR"/>
+        </w:rPr>
+        <w:t>magic</w:t>
+      </w:r>
+      <w:r>
+        <w:rPr>
+          <w:rFonts w:hint="cs"/>
+          <w:rtl/>
+          <w:lang w:bidi="fa-IR"/>
+        </w:rPr>
+        <w:t xml:space="preserve"> کاربر توسط سرور ارسال شده و در سمت </w:t>
+      </w:r>
+      <w:r>
+        <w:rPr>
+          <w:lang w:bidi="fa-IR"/>
+        </w:rPr>
+        <w:t>client</w:t>
+      </w:r>
+      <w:r>
+        <w:rPr>
+          <w:rFonts w:hint="cs"/>
+          <w:rtl/>
+          <w:lang w:bidi="fa-IR"/>
+        </w:rPr>
+        <w:t xml:space="preserve"> تنظیم می‌شود.</w:t>
+      </w:r>
+    </w:p>
+    <w:p>
+      <w:pPr>
+        <w:pStyle w:val="ListParagraph"/>
+        <w:numPr>
+          <w:ilvl w:val="0"/>
+          <w:numId w:val="1"/>
+        </w:numPr>
+        <w:bidi/>
+        <w:rPr>
+          <w:lang w:bidi="fa-IR"/>
+        </w:rPr>
+      </w:pPr>
+      <w:r>
+        <w:rPr>
+          <w:lang w:bidi="fa-IR"/>
+        </w:rPr>
+        <w:t>End</w:t>
+      </w:r>
+      <w:r>
+        <w:rPr>
+          <w:rFonts w:hint="cs"/>
+          <w:rtl/>
+          <w:lang w:bidi="fa-IR"/>
+        </w:rPr>
+        <w:t>: یکی از بازیکنان برنده بازی شده و بازی اتمام یافته است.</w:t>
+      </w:r>
+    </w:p>
+    <w:p>
+      <w:pPr>
+        <w:pStyle w:val="Heading2"/>
+        <w:bidi/>
+        <w:rPr>
+          <w:rtl/>
+          <w:lang w:bidi="fa-IR"/>
+        </w:rPr>
+      </w:pPr>
+      <w:r>
+        <w:rPr>
+          <w:rFonts w:hint="cs"/>
+          <w:rtl/>
+          <w:lang w:bidi="fa-IR"/>
+        </w:rPr>
+        <w:t xml:space="preserve">تابع </w:t>
+      </w:r>
+      <w:proofErr w:type="spellStart"/>
+      <w:r>
+        <w:rPr>
+          <w:lang w:bidi="fa-IR"/>
+        </w:rPr>
+        <w:t>find_character</w:t>
+      </w:r>
+      <w:proofErr w:type="spellEnd"/>
+    </w:p>
+    <w:p>
+      <w:pPr>
+        <w:bidi/>
+        <w:rPr>
+          <w:rtl/>
+          <w:lang w:bidi="fa-IR"/>
+        </w:rPr>
+      </w:pPr>
+      <w:r>
+        <w:rPr>
+          <w:rFonts w:hint="cs"/>
+          <w:rtl/>
+          <w:lang w:bidi="fa-IR"/>
+        </w:rPr>
+        <w:t>با دریافت نام یک کاراکتر از مجموعه شخصیت های بازی، مقادیر و اطلاعات مربوط به آن را از دیکشنری کاراکتر ها برمی‌گرداند.</w:t>
+      </w:r>
+    </w:p>
+    <w:p>
+      <w:pPr>
+        <w:pStyle w:val="Heading2"/>
+        <w:bidi/>
+        <w:rPr>
+          <w:lang w:bidi="fa-IR"/>
+        </w:rPr>
+      </w:pPr>
+      <w:r>
+        <w:rPr>
+          <w:rFonts w:hint="cs"/>
+          <w:rtl/>
+          <w:lang w:bidi="fa-IR"/>
+        </w:rPr>
+        <w:t xml:space="preserve">تابع </w:t>
+      </w:r>
+      <w:proofErr w:type="spellStart"/>
+      <w:r>
+        <w:rPr>
+          <w:lang w:bidi="fa-IR"/>
+        </w:rPr>
+        <w:t>extract_characters</w:t>
+      </w:r>
+      <w:proofErr w:type="spellEnd"/>
+    </w:p>
+    <w:p>
+      <w:pPr>
+        <w:bidi/>
+        <w:rPr>
+          <w:rtl/>
+          <w:lang w:bidi="fa-IR"/>
+        </w:rPr>
+      </w:pPr>
+      <w:r>
+        <w:rPr>
+          <w:lang w:bidi="fa-IR"/>
+        </w:rPr>
+        <w:t xml:space="preserve"> </w:t>
+      </w:r>
+      <w:r>
+        <w:rPr>
+          <w:rFonts w:hint="cs"/>
+          <w:rtl/>
+          <w:lang w:bidi="fa-IR"/>
+        </w:rPr>
+        <w:t xml:space="preserve">پیام دریافتی از سرور که شامل اطلاعات کاراکترهاست به صورت </w:t>
+      </w:r>
+      <w:r>
+        <w:rPr>
+          <w:lang w:bidi="fa-IR"/>
+        </w:rPr>
+        <w:t>str</w:t>
+      </w:r>
+      <w:r>
+        <w:rPr>
+          <w:rFonts w:hint="cs"/>
+          <w:rtl/>
+          <w:lang w:bidi="fa-IR"/>
+        </w:rPr>
+        <w:t xml:space="preserve"> است و برای تبدیل آن به متغیری قابل پیمایش از کتابخانه </w:t>
+      </w:r>
+      <w:r>
+        <w:rPr>
+          <w:lang w:bidi="fa-IR"/>
+        </w:rPr>
+        <w:t>json</w:t>
+      </w:r>
+      <w:r>
+        <w:rPr>
+          <w:rFonts w:hint="cs"/>
+          <w:rtl/>
+          <w:lang w:bidi="fa-IR"/>
+        </w:rPr>
+        <w:t xml:space="preserve"> و تابع </w:t>
+      </w:r>
+      <w:r>
+        <w:rPr>
+          <w:lang w:bidi="fa-IR"/>
+        </w:rPr>
+        <w:t>loads</w:t>
+      </w:r>
+      <w:r>
+        <w:rPr>
+          <w:rFonts w:hint="cs"/>
+          <w:rtl/>
+          <w:lang w:bidi="fa-IR"/>
+        </w:rPr>
+        <w:t xml:space="preserve"> استفاده می‌شود.</w:t>
+      </w:r>
+    </w:p>
+    <w:p>
+      <w:pPr>
+        <w:pStyle w:val="Heading2"/>
+        <w:bidi/>
+        <w:rPr>
+          <w:lang w:bidi="fa-IR"/>
+        </w:rPr>
+      </w:pPr>
+      <w:r>
+        <w:rPr>
+          <w:rFonts w:hint="cs"/>
+          <w:rtl/>
+          <w:lang w:bidi="fa-IR"/>
+        </w:rPr>
+        <w:t xml:space="preserve">تابع </w:t>
+      </w:r>
+      <w:proofErr w:type="spellStart"/>
+      <w:r>
+        <w:rPr>
+          <w:lang w:bidi="fa-IR"/>
+        </w:rPr>
+        <w:t>start_game</w:t>
+      </w:r>
+      <w:proofErr w:type="spellEnd"/>
+    </w:p>
+    <w:p>
+      <w:pPr>
+        <w:bidi/>
+        <w:rPr>
+          <w:rtl/>
+          <w:lang w:bidi="fa-IR"/>
+        </w:rPr>
+      </w:pPr>
+      <w:r>
+        <w:rPr>
+          <w:rFonts w:hint="cs"/>
+          <w:rtl/>
+          <w:lang w:bidi="fa-IR"/>
+        </w:rPr>
+        <w:t>پس از انتخاب کاراکتر توسط کاربر، صفحه بازی به صحنه انتظار تغییر یافته و پیام انتخاب کاراکتر به سرور ارسال میشود.</w:t>
+      </w:r>
+    </w:p>
+    <w:p>
+      <w:pPr>
+        <w:pStyle w:val="Heading2"/>
+        <w:bidi/>
+        <w:rPr>
+          <w:rtl/>
+          <w:lang w:bidi="fa-IR"/>
+        </w:rPr>
+      </w:pPr>
+      <w:r>
+        <w:rPr>
+          <w:rFonts w:hint="cs"/>
+          <w:rtl/>
+          <w:lang w:bidi="fa-IR"/>
+        </w:rPr>
+        <w:t xml:space="preserve">تابع </w:t>
+      </w:r>
+      <w:proofErr w:type="spellStart"/>
+      <w:r>
+        <w:rPr>
+          <w:lang w:bidi="fa-IR"/>
+        </w:rPr>
+        <w:t>start_new_game</w:t>
+      </w:r>
+      <w:proofErr w:type="spellEnd"/>
+    </w:p>
+    <w:p>
+      <w:pPr>
+        <w:bidi/>
+        <w:rPr>
+          <w:rtl/>
+          <w:lang w:bidi="fa-IR"/>
+        </w:rPr>
+      </w:pPr>
+      <w:r>
+        <w:rPr>
+          <w:rFonts w:hint="cs"/>
+          <w:rtl/>
+          <w:lang w:bidi="fa-IR"/>
+        </w:rPr>
+        <w:t>در صورت اتمام کامل بازی و برنده شدن یکی از بازیکنان و تمایل ایشان به شروع دوباره بازی، این تابع صدا زده شده و مقادیر کاراکتر ها به حالت پیشفرض برمی‌گردند تا دور جدید بازی آغاز شود.</w:t>
+      </w:r>
+    </w:p>
+    <w:p>
+      <w:pPr>
+        <w:bidi/>
+        <w:rPr>
+          <w:rtl/>
+          <w:lang w:bidi="fa-IR"/>
+        </w:rPr>
+      </w:pPr>
+    </w:p>
+    <w:p>
+      <w:pPr>
+        <w:pStyle w:val="Heading2"/>
+        <w:bidi/>
+        <w:rPr>
+          <w:lang w:bidi="fa-IR"/>
+        </w:rPr>
+      </w:pPr>
+      <w:r>
+        <w:rPr>
+          <w:rFonts w:hint="cs"/>
+          <w:rtl/>
+          <w:lang w:bidi="fa-IR"/>
+        </w:rPr>
+        <w:lastRenderedPageBreak/>
+        <w:t xml:space="preserve">تابع </w:t>
+      </w:r>
+      <w:proofErr w:type="spellStart"/>
+      <w:r>
+        <w:rPr>
+          <w:lang w:bidi="fa-IR"/>
+        </w:rPr>
+        <w:t>handle_scence</w:t>
+      </w:r>
+      <w:proofErr w:type="spellEnd"/>
+    </w:p>
+    <w:p>
+      <w:pPr>
+        <w:bidi/>
+        <w:rPr>
+          <w:rtl/>
+          <w:lang w:bidi="fa-IR"/>
+        </w:rPr>
+      </w:pPr>
+      <w:r>
+        <w:rPr>
+          <w:rFonts w:hint="cs"/>
+          <w:rtl/>
+          <w:lang w:bidi="fa-IR"/>
+        </w:rPr>
+        <w:t xml:space="preserve">با دریافت </w:t>
+      </w:r>
+      <w:r>
+        <w:rPr>
+          <w:lang w:bidi="fa-IR"/>
+        </w:rPr>
+        <w:t>event</w:t>
+      </w:r>
+      <w:r>
+        <w:rPr>
+          <w:rFonts w:hint="cs"/>
+          <w:rtl/>
+          <w:lang w:bidi="fa-IR"/>
+        </w:rPr>
+        <w:t xml:space="preserve"> های پای گیم (که شامل تمام تحرکات کاربر و برنامه در طول اجرای بازی است) و بررسی متغیر </w:t>
+      </w:r>
+      <w:r>
+        <w:rPr>
+          <w:lang w:bidi="fa-IR"/>
+        </w:rPr>
+        <w:t>SCENE</w:t>
+      </w:r>
+      <w:r>
+        <w:rPr>
+          <w:rFonts w:hint="cs"/>
+          <w:rtl/>
+          <w:lang w:bidi="fa-IR"/>
+        </w:rPr>
+        <w:t xml:space="preserve">، به </w:t>
+      </w:r>
+      <w:r>
+        <w:rPr>
+          <w:rFonts w:hint="cs"/>
+          <w:rtl/>
+          <w:lang w:bidi="fa-IR"/>
+        </w:rPr>
+        <w:t xml:space="preserve">تغییر صحنه بازی می‌پردازد. به طور کلی بازی دارای 6 صحنه اصلی است که عبارت‌اند از: </w:t>
+      </w:r>
+    </w:p>
+    <w:p>
+      <w:pPr>
+        <w:pStyle w:val="ListParagraph"/>
+        <w:numPr>
+          <w:ilvl w:val="0"/>
+          <w:numId w:val="2"/>
+        </w:numPr>
+        <w:bidi/>
+        <w:rPr>
+          <w:lang w:bidi="fa-IR"/>
+        </w:rPr>
+      </w:pPr>
+      <w:proofErr w:type="spellStart"/>
+      <w:r>
+        <w:rPr>
+          <w:lang w:bidi="fa-IR"/>
+        </w:rPr>
+        <w:t>Choosing_character</w:t>
+      </w:r>
+      <w:proofErr w:type="spellEnd"/>
+    </w:p>
+    <w:p>
+      <w:pPr>
+        <w:pStyle w:val="ListParagraph"/>
+        <w:numPr>
+          <w:ilvl w:val="0"/>
+          <w:numId w:val="2"/>
+        </w:numPr>
+        <w:bidi/>
+        <w:rPr>
+          <w:lang w:bidi="fa-IR"/>
+        </w:rPr>
+      </w:pPr>
+      <w:r>
+        <w:rPr>
+          <w:lang w:bidi="fa-IR"/>
+        </w:rPr>
+        <w:t>Waiting</w:t>
+      </w:r>
+    </w:p>
+    <w:p>
+      <w:pPr>
+        <w:pStyle w:val="ListParagraph"/>
+        <w:numPr>
+          <w:ilvl w:val="0"/>
+          <w:numId w:val="2"/>
+        </w:numPr>
+        <w:bidi/>
+        <w:rPr>
+          <w:lang w:bidi="fa-IR"/>
+        </w:rPr>
+      </w:pPr>
+      <w:r>
+        <w:rPr>
+          <w:lang w:bidi="fa-IR"/>
+        </w:rPr>
+        <w:t>Connecting</w:t>
+      </w:r>
+    </w:p>
+    <w:p>
+      <w:pPr>
+        <w:pStyle w:val="ListParagraph"/>
+        <w:numPr>
+          <w:ilvl w:val="0"/>
+          <w:numId w:val="2"/>
+        </w:numPr>
+        <w:bidi/>
+        <w:rPr>
+          <w:lang w:bidi="fa-IR"/>
+        </w:rPr>
+      </w:pPr>
+      <w:r>
+        <w:rPr>
+          <w:lang w:bidi="fa-IR"/>
+        </w:rPr>
+        <w:t>Playing</w:t>
+      </w:r>
+    </w:p>
+    <w:p>
+      <w:pPr>
+        <w:pStyle w:val="ListParagraph"/>
+        <w:numPr>
+          <w:ilvl w:val="0"/>
+          <w:numId w:val="2"/>
+        </w:numPr>
+        <w:bidi/>
+        <w:rPr>
+          <w:lang w:bidi="fa-IR"/>
+        </w:rPr>
+      </w:pPr>
+      <w:proofErr w:type="spellStart"/>
+      <w:r>
+        <w:rPr>
+          <w:lang w:bidi="fa-IR"/>
+        </w:rPr>
+        <w:t>Connection_error</w:t>
+      </w:r>
+      <w:proofErr w:type="spellEnd"/>
+    </w:p>
+    <w:p>
+      <w:pPr>
+        <w:pStyle w:val="ListParagraph"/>
+        <w:numPr>
+          <w:ilvl w:val="0"/>
+          <w:numId w:val="2"/>
+        </w:numPr>
+        <w:bidi/>
+        <w:rPr>
+          <w:lang w:bidi="fa-IR"/>
+        </w:rPr>
+      </w:pPr>
+      <w:r>
+        <w:rPr>
+          <w:lang w:bidi="fa-IR"/>
+        </w:rPr>
+        <w:t>Ending</w:t>
+      </w:r>
+    </w:p>
+    <w:p>
+      <w:pPr>
+        <w:pStyle w:val="Heading2"/>
+        <w:bidi/>
+        <w:rPr>
+          <w:rtl/>
+          <w:lang w:bidi="fa-IR"/>
+        </w:rPr>
+      </w:pPr>
+      <w:r>
+        <w:rPr>
+          <w:rFonts w:hint="cs"/>
+          <w:rtl/>
+          <w:lang w:bidi="fa-IR"/>
+        </w:rPr>
+        <w:t xml:space="preserve">تابع </w:t>
+      </w:r>
+      <w:r>
+        <w:rPr>
+          <w:lang w:bidi="fa-IR"/>
+        </w:rPr>
+        <w:t>main</w:t>
+      </w:r>
+    </w:p>
+    <w:p>
+      <w:pPr>
+        <w:bidi/>
+        <w:rPr>
+          <w:rtl/>
+          <w:lang w:bidi="fa-IR"/>
+        </w:rPr>
+      </w:pPr>
+      <w:r>
+        <w:rPr>
+          <w:rFonts w:hint="cs"/>
+          <w:rtl/>
+          <w:lang w:bidi="fa-IR"/>
+        </w:rPr>
+        <w:t xml:space="preserve">با تنظیم </w:t>
+      </w:r>
+      <w:r>
+        <w:rPr>
+          <w:lang w:bidi="fa-IR"/>
+        </w:rPr>
+        <w:t>Clock</w:t>
+      </w:r>
+      <w:r>
+        <w:rPr>
+          <w:rFonts w:hint="cs"/>
+          <w:rtl/>
+          <w:lang w:bidi="fa-IR"/>
+        </w:rPr>
+        <w:t xml:space="preserve"> کتابخانه </w:t>
+      </w:r>
+      <w:proofErr w:type="spellStart"/>
+      <w:r>
+        <w:rPr>
+          <w:lang w:bidi="fa-IR"/>
+        </w:rPr>
+        <w:t>Pygame</w:t>
+      </w:r>
+      <w:proofErr w:type="spellEnd"/>
+      <w:r>
+        <w:rPr>
+          <w:rFonts w:hint="cs"/>
+          <w:rtl/>
+          <w:lang w:bidi="fa-IR"/>
+        </w:rPr>
+        <w:t xml:space="preserve"> به اجرای بازی </w:t>
+      </w:r>
+      <w:r>
+        <w:rPr>
+          <w:rFonts w:hint="cs"/>
+          <w:rtl/>
+          <w:lang w:bidi="fa-IR"/>
+        </w:rPr>
+        <w:t xml:space="preserve">با </w:t>
+      </w:r>
+      <w:r>
+        <w:rPr>
+          <w:lang w:bidi="fa-IR"/>
+        </w:rPr>
+        <w:t>FPS</w:t>
+      </w:r>
+      <w:r>
+        <w:rPr>
+          <w:rFonts w:hint="cs"/>
+          <w:rtl/>
+          <w:lang w:bidi="fa-IR"/>
+        </w:rPr>
+        <w:t xml:space="preserve"> 60 پرداخته و به سرور متصل می‌شود.</w:t>
+      </w:r>
+    </w:p>
+    <w:p>
+      <w:pPr>
+        <w:bidi/>
+        <w:rPr>
+          <w:rtl/>
+          <w:lang w:bidi="fa-IR"/>
+        </w:rPr>
+      </w:pPr>
+    </w:p>
+    <w:p>
+      <w:pPr>
+        <w:pStyle w:val="Heading1"/>
+        <w:bidi/>
+        <w:rPr>
+          <w:lang w:bidi="fa-IR"/>
+        </w:rPr>
+      </w:pPr>
+      <w:r>
+        <w:rPr>
+          <w:rFonts w:hint="cs"/>
+          <w:rtl/>
+          <w:lang w:bidi="fa-IR"/>
+        </w:rPr>
+        <w:t xml:space="preserve">فایل </w:t>
+      </w:r>
+      <w:r>
+        <w:rPr>
+          <w:lang w:bidi="fa-IR"/>
+        </w:rPr>
+        <w:t>ui.py</w:t>
+      </w:r>
+    </w:p>
+    <w:p>
+      <w:pPr>
+        <w:bidi/>
+        <w:rPr>
+          <w:rtl/>
+          <w:lang w:bidi="fa-IR"/>
+        </w:rPr>
+      </w:pPr>
+      <w:r>
+        <w:rPr>
+          <w:rFonts w:hint="cs"/>
+          <w:rtl/>
+          <w:lang w:bidi="fa-IR"/>
+        </w:rPr>
+        <w:t>توابع مورد نیاز برای ایجاد رابط گرافیکی بازی را در برمی‌گیرد</w:t>
+      </w:r>
+      <w:r>
+        <w:rPr>
+          <w:lang w:bidi="fa-IR"/>
+        </w:rPr>
+        <w:t>.</w:t>
+      </w:r>
+    </w:p>
+    <w:p>
+      <w:pPr>
+        <w:bidi/>
+        <w:rPr>
+          <w:rtl/>
+          <w:lang w:bidi="fa-IR"/>
+        </w:rPr>
+      </w:pPr>
+      <w:r>
+        <w:rPr>
+          <w:rFonts w:hint="cs"/>
+          <w:rtl/>
+          <w:lang w:bidi="fa-IR"/>
+        </w:rPr>
+        <w:t>در ابتدا آدرس فونت (های) مورد نیاز بازی تنظیم می‌شود.</w:t>
+      </w:r>
+    </w:p>
+    <w:p>
+      <w:pPr>
+        <w:pStyle w:val="Heading2"/>
+        <w:bidi/>
+        <w:rPr>
+          <w:rtl/>
+          <w:lang w:bidi="fa-IR"/>
+        </w:rPr>
+      </w:pPr>
+      <w:r>
+        <w:rPr>
+          <w:rFonts w:hint="cs"/>
+          <w:rtl/>
+          <w:lang w:bidi="fa-IR"/>
+        </w:rPr>
+        <w:t xml:space="preserve">کلاس </w:t>
+      </w:r>
+      <w:r>
+        <w:rPr>
+          <w:lang w:bidi="fa-IR"/>
+        </w:rPr>
+        <w:t>Colors</w:t>
+      </w:r>
+    </w:p>
+    <w:p>
+      <w:pPr>
+        <w:bidi/>
+        <w:rPr>
+          <w:rtl/>
+          <w:lang w:bidi="fa-IR"/>
+        </w:rPr>
+      </w:pPr>
+      <w:r>
+        <w:rPr>
+          <w:rFonts w:hint="cs"/>
+          <w:rtl/>
+          <w:lang w:bidi="fa-IR"/>
+        </w:rPr>
+        <w:t xml:space="preserve">حاوی سه مقدار </w:t>
+      </w:r>
+      <w:r>
+        <w:rPr>
+          <w:lang w:bidi="fa-IR"/>
+        </w:rPr>
+        <w:t>BLACK</w:t>
+      </w:r>
+      <w:r>
+        <w:rPr>
+          <w:rFonts w:hint="cs"/>
+          <w:rtl/>
+          <w:lang w:bidi="fa-IR"/>
+        </w:rPr>
+        <w:t xml:space="preserve">، </w:t>
+      </w:r>
+      <w:r>
+        <w:rPr>
+          <w:lang w:bidi="fa-IR"/>
+        </w:rPr>
+        <w:t>WHITE</w:t>
+      </w:r>
+      <w:r>
+        <w:rPr>
+          <w:rFonts w:hint="cs"/>
+          <w:rtl/>
+          <w:lang w:bidi="fa-IR"/>
+        </w:rPr>
+        <w:t xml:space="preserve"> و </w:t>
+      </w:r>
+      <w:r>
+        <w:rPr>
+          <w:lang w:bidi="fa-IR"/>
+        </w:rPr>
+        <w:t>GRAY</w:t>
+      </w:r>
+      <w:r>
+        <w:rPr>
+          <w:rFonts w:hint="cs"/>
+          <w:rtl/>
+          <w:lang w:bidi="fa-IR"/>
+        </w:rPr>
+        <w:t xml:space="preserve"> است که در تنظیم </w:t>
+      </w:r>
+      <w:r>
+        <w:rPr>
+          <w:lang w:bidi="fa-IR"/>
+        </w:rPr>
+        <w:t>Theme</w:t>
+      </w:r>
+      <w:r>
+        <w:rPr>
+          <w:rFonts w:hint="cs"/>
+          <w:rtl/>
+          <w:lang w:bidi="fa-IR"/>
+        </w:rPr>
+        <w:t xml:space="preserve"> اصلی بازی نقش دارند.</w:t>
+      </w:r>
+    </w:p>
+    <w:p>
+      <w:pPr>
+        <w:bidi/>
+        <w:rPr>
+          <w:lang w:bidi="fa-IR"/>
+        </w:rPr>
+      </w:pPr>
+      <w:r>
+        <w:rPr>
+          <w:rFonts w:hint="cs"/>
+          <w:rtl/>
+          <w:lang w:bidi="fa-IR"/>
+        </w:rPr>
+        <w:t xml:space="preserve">بازی در حالت اولیه در </w:t>
+      </w:r>
+      <w:r>
+        <w:rPr>
+          <w:lang w:bidi="fa-IR"/>
+        </w:rPr>
+        <w:t>LIGHT_THEME</w:t>
+      </w:r>
+      <w:r>
+        <w:rPr>
+          <w:rFonts w:hint="cs"/>
+          <w:rtl/>
+          <w:lang w:bidi="fa-IR"/>
+        </w:rPr>
+        <w:t xml:space="preserve"> قرار دارد. در ادامه نیز یک شئ از کلاس </w:t>
+      </w:r>
+      <w:r>
+        <w:rPr>
+          <w:lang w:bidi="fa-IR"/>
+        </w:rPr>
+        <w:t>Colors</w:t>
+      </w:r>
+      <w:r>
+        <w:rPr>
+          <w:rFonts w:hint="cs"/>
+          <w:rtl/>
+          <w:lang w:bidi="fa-IR"/>
+        </w:rPr>
+        <w:t xml:space="preserve"> ایجاد می‌شود</w:t>
+      </w:r>
+      <w:r>
+        <w:rPr>
+          <w:lang w:bidi="fa-IR"/>
+        </w:rPr>
+        <w:t>.</w:t>
+      </w:r>
+    </w:p>
+    <w:p>
+      <w:pPr>
+        <w:pStyle w:val="Heading2"/>
+        <w:bidi/>
+        <w:rPr>
+          <w:rtl/>
+          <w:lang w:bidi="fa-IR"/>
+        </w:rPr>
+      </w:pPr>
+      <w:r>
+        <w:rPr>
+          <w:rFonts w:hint="cs"/>
+          <w:rtl/>
+          <w:lang w:bidi="fa-IR"/>
+        </w:rPr>
+        <w:t xml:space="preserve">تابع </w:t>
+      </w:r>
+      <w:r>
+        <w:rPr>
+          <w:lang w:bidi="fa-IR"/>
+        </w:rPr>
+        <w:t>window</w:t>
+      </w:r>
+    </w:p>
+    <w:p>
+      <w:pPr>
+        <w:bidi/>
+        <w:rPr>
+          <w:rFonts w:hint="cs"/>
+          <w:rtl/>
+          <w:lang w:bidi="fa-IR"/>
+        </w:rPr>
+      </w:pPr>
+      <w:proofErr w:type="spellStart"/>
+      <w:r>
+        <w:rPr>
+          <w:lang w:bidi="fa-IR"/>
+        </w:rPr>
+        <w:t>Pygame</w:t>
+      </w:r>
+      <w:proofErr w:type="spellEnd"/>
+      <w:r>
+        <w:rPr>
+          <w:rFonts w:hint="cs"/>
+          <w:rtl/>
+          <w:lang w:bidi="fa-IR"/>
+        </w:rPr>
+        <w:t xml:space="preserve"> برای پردازش صفحه بازی نیاز به صدا زدن تابع </w:t>
+      </w:r>
+      <w:r>
+        <w:rPr>
+          <w:lang w:bidi="fa-IR"/>
+        </w:rPr>
+        <w:t>window</w:t>
+      </w:r>
+      <w:r>
+        <w:rPr>
+          <w:rFonts w:hint="cs"/>
+          <w:rtl/>
+          <w:lang w:bidi="fa-IR"/>
+        </w:rPr>
+        <w:t xml:space="preserve"> دارد، به همین دلیل برای جلوگیری از تکرار مکررات و سهولت در </w:t>
+      </w:r>
+      <w:r>
+        <w:rPr>
+          <w:lang w:bidi="fa-IR"/>
+        </w:rPr>
+        <w:t>render</w:t>
+      </w:r>
+      <w:r>
+        <w:rPr>
+          <w:rFonts w:hint="cs"/>
+          <w:rtl/>
+          <w:lang w:bidi="fa-IR"/>
+        </w:rPr>
+        <w:t xml:space="preserve"> هر فریم از بازی، از تابع </w:t>
+      </w:r>
+      <w:r>
+        <w:rPr>
+          <w:lang w:bidi="fa-IR"/>
+        </w:rPr>
+        <w:t>window</w:t>
+      </w:r>
+      <w:r>
+        <w:rPr>
+          <w:rFonts w:hint="cs"/>
+          <w:rtl/>
+          <w:lang w:bidi="fa-IR"/>
+        </w:rPr>
+        <w:t xml:space="preserve"> استفاده می‌شود.</w:t>
+      </w:r>
+    </w:p>
+    <w:p>
+      <w:pPr>
+        <w:pStyle w:val="Heading2"/>
+        <w:bidi/>
+        <w:rPr>
+          <w:rtl/>
+          <w:lang w:bidi="fa-IR"/>
+        </w:rPr>
+      </w:pPr>
+      <w:r>
+        <w:rPr>
+          <w:rFonts w:hint="cs"/>
+          <w:rtl/>
+          <w:lang w:bidi="fa-IR"/>
+        </w:rPr>
+        <w:t xml:space="preserve">تابع </w:t>
+      </w:r>
+      <w:proofErr w:type="spellStart"/>
+      <w:r>
+        <w:rPr>
+          <w:lang w:bidi="fa-IR"/>
+        </w:rPr>
+        <w:t>change_light_theme</w:t>
+      </w:r>
+      <w:proofErr w:type="spellEnd"/>
+    </w:p>
+    <w:p>
+      <w:pPr>
+        <w:bidi/>
+        <w:rPr>
+          <w:rtl/>
+          <w:lang w:bidi="fa-IR"/>
+        </w:rPr>
+      </w:pPr>
+      <w:r>
+        <w:rPr>
+          <w:rFonts w:hint="cs"/>
+          <w:rtl/>
+          <w:lang w:bidi="fa-IR"/>
+        </w:rPr>
+        <w:t xml:space="preserve">رنگ های شئ از پیش تعریف شده‌ی </w:t>
+      </w:r>
+      <w:r>
+        <w:rPr>
+          <w:lang w:bidi="fa-IR"/>
+        </w:rPr>
+        <w:t>colors</w:t>
+      </w:r>
+      <w:r>
+        <w:rPr>
+          <w:rFonts w:hint="cs"/>
+          <w:rtl/>
+          <w:lang w:bidi="fa-IR"/>
+        </w:rPr>
+        <w:t xml:space="preserve"> را در صورت تغییر </w:t>
+      </w:r>
+      <w:r>
+        <w:rPr>
+          <w:lang w:bidi="fa-IR"/>
+        </w:rPr>
+        <w:t>theme</w:t>
+      </w:r>
+      <w:r>
+        <w:rPr>
+          <w:rFonts w:hint="cs"/>
+          <w:rtl/>
+          <w:lang w:bidi="fa-IR"/>
+        </w:rPr>
+        <w:t xml:space="preserve"> از </w:t>
+      </w:r>
+      <w:r>
+        <w:rPr>
+          <w:lang w:bidi="fa-IR"/>
+        </w:rPr>
+        <w:t>light</w:t>
+      </w:r>
+      <w:r>
+        <w:rPr>
+          <w:rFonts w:hint="cs"/>
+          <w:rtl/>
+          <w:lang w:bidi="fa-IR"/>
+        </w:rPr>
+        <w:t xml:space="preserve"> به </w:t>
+      </w:r>
+      <w:r>
+        <w:rPr>
+          <w:lang w:bidi="fa-IR"/>
+        </w:rPr>
+        <w:t>dark</w:t>
+      </w:r>
+      <w:r>
+        <w:rPr>
+          <w:rFonts w:hint="cs"/>
+          <w:rtl/>
+          <w:lang w:bidi="fa-IR"/>
+        </w:rPr>
+        <w:t xml:space="preserve"> تعویض می‌کند.</w:t>
+      </w:r>
+    </w:p>
+    <w:p>
+      <w:pPr>
+        <w:pStyle w:val="Heading2"/>
+        <w:bidi/>
+        <w:rPr>
+          <w:lang w:bidi="fa-IR"/>
+        </w:rPr>
+      </w:pPr>
+      <w:r>
+        <w:rPr>
+          <w:rFonts w:hint="cs"/>
+          <w:rtl/>
+          <w:lang w:bidi="fa-IR"/>
+        </w:rPr>
+        <w:t xml:space="preserve">تابع </w:t>
+      </w:r>
+      <w:proofErr w:type="spellStart"/>
+      <w:r>
+        <w:rPr>
+          <w:lang w:bidi="fa-IR"/>
+        </w:rPr>
+        <w:t>draw_text</w:t>
+      </w:r>
+      <w:proofErr w:type="spellEnd"/>
+    </w:p>
+    <w:p>
+      <w:pPr>
+        <w:bidi/>
+        <w:rPr>
+          <w:lang w:bidi="fa-IR"/>
+        </w:rPr>
+      </w:pPr>
+      <w:r>
+        <w:rPr>
+          <w:rFonts w:hint="cs"/>
+          <w:rtl/>
+          <w:lang w:bidi="fa-IR"/>
+        </w:rPr>
+        <w:t xml:space="preserve">با دریافت متن، مختصات و رنگ مورد نظر، به </w:t>
+      </w:r>
+      <w:r>
+        <w:rPr>
+          <w:rFonts w:hint="cs"/>
+          <w:rtl/>
+          <w:lang w:bidi="fa-IR"/>
+        </w:rPr>
+        <w:t>نوشتن آن می‌پردازد.</w:t>
+      </w:r>
+    </w:p>
+    <w:p>
+      <w:pPr>
+        <w:pStyle w:val="Heading2"/>
+        <w:bidi/>
+        <w:rPr>
+          <w:rtl/>
+          <w:lang w:bidi="fa-IR"/>
+        </w:rPr>
+      </w:pPr>
+      <w:r>
+        <w:rPr>
+          <w:rFonts w:hint="cs"/>
+          <w:rtl/>
+          <w:lang w:bidi="fa-IR"/>
+        </w:rPr>
+        <w:t xml:space="preserve">تابع </w:t>
+      </w:r>
+      <w:proofErr w:type="spellStart"/>
+      <w:r>
+        <w:rPr>
+          <w:lang w:bidi="fa-IR"/>
+        </w:rPr>
+        <w:t>draw_</w:t>
+      </w:r>
+      <w:r>
+        <w:rPr>
+          <w:lang w:bidi="fa-IR"/>
+        </w:rPr>
+        <w:t>center_text</w:t>
+      </w:r>
+      <w:proofErr w:type="spellEnd"/>
+    </w:p>
+    <w:p>
+      <w:pPr>
+        <w:bidi/>
+        <w:rPr>
+          <w:rtl/>
+          <w:lang w:bidi="fa-IR"/>
+        </w:rPr>
+      </w:pPr>
+      <w:r>
+        <w:rPr>
+          <w:rFonts w:hint="cs"/>
+          <w:rtl/>
+          <w:lang w:bidi="fa-IR"/>
+        </w:rPr>
+        <w:t xml:space="preserve">با توجه به نیاز مکرر در طول اجرای بازی به نوشتن یک متن در مرکز صفحه، نوشتن یک تابع جداگانه برای محاسبه مختصات مرکز و نمایش متن در نقطه مورد نظر نیاز است. </w:t>
+      </w:r>
+    </w:p>
+    <w:p>
+      <w:pPr>
+        <w:pStyle w:val="Heading2"/>
+        <w:bidi/>
+        <w:rPr>
+          <w:rtl/>
+          <w:lang w:bidi="fa-IR"/>
+        </w:rPr>
+      </w:pPr>
+      <w:r>
+        <w:rPr>
+          <w:rFonts w:hint="cs"/>
+          <w:rtl/>
+          <w:lang w:bidi="fa-IR"/>
+        </w:rPr>
+        <w:t>تا</w:t>
+      </w:r>
+      <w:r>
+        <w:rPr>
+          <w:rFonts w:hint="cs"/>
+          <w:rtl/>
+          <w:lang w:bidi="fa-IR"/>
+        </w:rPr>
+        <w:t xml:space="preserve">بع </w:t>
+      </w:r>
+      <w:proofErr w:type="spellStart"/>
+      <w:r>
+        <w:rPr>
+          <w:lang w:bidi="fa-IR"/>
+        </w:rPr>
+        <w:t>draw_center_text_list</w:t>
+      </w:r>
+      <w:proofErr w:type="spellEnd"/>
+    </w:p>
+    <w:p>
+      <w:pPr>
+        <w:bidi/>
+        <w:rPr>
+          <w:rtl/>
+          <w:lang w:bidi="fa-IR"/>
+        </w:rPr>
+      </w:pPr>
+      <w:r>
+        <w:rPr>
+          <w:rFonts w:hint="cs"/>
+          <w:rtl/>
+          <w:lang w:bidi="fa-IR"/>
+        </w:rPr>
+        <w:t>در بخشی از بازی، متون مشخصی به صورت لیست چاپ خواهند شد که وظیفه انجام این کار به عهده این تابع است. بدین صورت که با محاسبه تعداد متون و ارتفاع کادر دربردارنده هر عضو از لیست، آن ها را در مرکز صفحه و زیر هم نمایش می‌دهد.</w:t>
+      </w:r>
+    </w:p>
+    <w:p>
+      <w:pPr>
+        <w:pStyle w:val="Heading2"/>
+        <w:bidi/>
+        <w:rPr>
+          <w:lang w:bidi="fa-IR"/>
+        </w:rPr>
+      </w:pPr>
+      <w:r>
+        <w:rPr>
+          <w:rFonts w:hint="cs"/>
+          <w:rtl/>
+          <w:lang w:bidi="fa-IR"/>
+        </w:rPr>
+        <w:t xml:space="preserve">تابع </w:t>
+      </w:r>
+      <w:proofErr w:type="spellStart"/>
+      <w:r>
+        <w:rPr>
+          <w:lang w:bidi="fa-IR"/>
+        </w:rPr>
+        <w:t>draw_fill_text</w:t>
+      </w:r>
+      <w:proofErr w:type="spellEnd"/>
+    </w:p>
+    <w:p>
+      <w:pPr>
+        <w:bidi/>
+        <w:rPr>
+          <w:rFonts w:hint="cs"/>
+          <w:rtl/>
+          <w:lang w:bidi="fa-IR"/>
+        </w:rPr>
+      </w:pPr>
+      <w:r>
+        <w:rPr>
+          <w:rFonts w:hint="cs"/>
+          <w:rtl/>
+          <w:lang w:bidi="fa-IR"/>
+        </w:rPr>
+        <w:t>یک مستطیلی توپر با مختصات دریافتی در صفحه رسم می‌کند.</w:t>
+      </w:r>
+    </w:p>
+    <w:p>
+      <w:pPr>
+        <w:bidi/>
+        <w:rPr>
+          <w:lang w:bidi="fa-IR"/>
+        </w:rPr>
+      </w:pPr>
+    </w:p>
+    <w:p>
+      <w:pPr>
+        <w:pStyle w:val="Heading1"/>
+        <w:bidi/>
+        <w:rPr>
+          <w:lang w:bidi="fa-IR"/>
+        </w:rPr>
+      </w:pPr>
+      <w:r>
+        <w:rPr>
+          <w:rFonts w:hint="cs"/>
+          <w:rtl/>
+          <w:lang w:bidi="fa-IR"/>
+        </w:rPr>
+        <w:lastRenderedPageBreak/>
+        <w:t xml:space="preserve">فایل </w:t>
+      </w:r>
+      <w:r>
+        <w:rPr>
+          <w:lang w:bidi="fa-IR"/>
+        </w:rPr>
+        <w:t>playing_scene.py</w:t>
+      </w:r>
+    </w:p>
+    <w:p>
+      <w:pPr>
+        <w:bidi/>
+        <w:rPr>
+          <w:rFonts w:hint="cs"/>
+          <w:rtl/>
+          <w:lang w:bidi="fa-IR"/>
+        </w:rPr>
+      </w:pPr>
+      <w:r>
+        <w:rPr>
+          <w:rFonts w:hint="cs"/>
+          <w:rtl/>
+          <w:lang w:bidi="fa-IR"/>
+        </w:rPr>
+        <w:t xml:space="preserve">المان های مربوط به صفحه </w:t>
+      </w:r>
+      <w:proofErr w:type="spellStart"/>
+      <w:r>
+        <w:rPr>
+          <w:lang w:bidi="fa-IR"/>
+        </w:rPr>
+        <w:t>playing_scene</w:t>
+      </w:r>
+      <w:proofErr w:type="spellEnd"/>
+      <w:r>
+        <w:rPr>
+          <w:rFonts w:hint="cs"/>
+          <w:rtl/>
+          <w:lang w:bidi="fa-IR"/>
+        </w:rPr>
+        <w:t xml:space="preserve"> بازی را رسم می‌کند.</w:t>
+      </w:r>
+    </w:p>
+    <w:p>
+      <w:pPr>
+        <w:bidi/>
+        <w:rPr>
+          <w:rtl/>
+          <w:lang w:bidi="fa-IR"/>
+        </w:rPr>
+      </w:pPr>
+    </w:p>
+    <w:p>
+      <w:pPr>
+        <w:bidi/>
+        <w:rPr>
+          <w:rFonts w:hint="cs"/>
+          <w:rtl/>
+          <w:lang w:bidi="fa-IR"/>
+        </w:rPr>
+      </w:pPr>
+    </w:p>
+    <w:p>
+      <w:pPr>
+        <w:bidi/>
+        <w:rPr>
+          <w:rtl/>
+          <w:lang w:bidi="fa-IR"/>
+        </w:rPr>
+      </w:pPr>
+    </w:p>
     <w:sectPr>
       <w:pgSz w:w="12240" w:h="15840"/>
       <w:pgMar w:top="1440" w:right="1440" w:bottom="1440" w:left="1440" w:header="720" w:footer="720" w:gutter="0"/>
@@ -11,6 +1907,243 @@
     </w:sectPr>
   </w:body>
 </w:document>
+</file>
+
+<file path=word/numbering.xml><?xml version="1.0" encoding="utf-8"?>
+<w:numbering xmlns:wpc="http://schemas.microsoft.com/office/word/2010/wordprocessingCanvas" xmlns:cx="http://schemas.microsoft.com/office/drawing/2014/chartex" xmlns:cx1="http://schemas.microsoft.com/office/drawing/2015/9/8/chartex" xmlns:cx2="http://schemas.microsoft.com/office/drawing/2015/10/21/chartex" xmlns:cx3="http://schemas.microsoft.com/office/drawing/2016/5/9/chartex" xmlns:cx4="http://schemas.microsoft.com/office/drawing/2016/5/10/chartex" xmlns:cx5="http://schemas.microsoft.com/office/drawing/2016/5/11/chartex" xmlns:cx6="http://schemas.microsoft.com/office/drawing/2016/5/12/chartex" xmlns:cx7="http://schemas.microsoft.com/office/drawing/2016/5/13/chartex" xmlns:cx8="http://schemas.microsoft.com/office/drawing/2016/5/14/chartex" xmlns:mc="http://schemas.openxmlformats.org/markup-compatibility/2006" xmlns:aink="http://schemas.microsoft.com/office/drawing/2016/ink" xmlns:am3d="http://schemas.microsoft.com/office/drawing/2017/model3d" xmlns:o="urn:schemas-microsoft-com:office:office" xmlns:r="http://schemas.openxmlformats.org/officeDocument/2006/relationships" xmlns:m="http://schemas.openxmlformats.org/officeDocument/2006/math" xmlns:v="urn:schemas-microsoft-com:vml" xmlns:wp14="http://schemas.microsoft.com/office/word/2010/wordprocessingDrawing" xmlns:wp="http://schemas.openxmlformats.org/drawingml/2006/wordprocessingDrawing" xmlns:w10="urn:schemas-microsoft-com:office:word" xmlns:w="http://schemas.openxmlformats.org/wordprocessingml/2006/main" xmlns:w14="http://schemas.microsoft.com/office/word/2010/wordml" xmlns:w15="http://schemas.microsoft.com/office/word/2012/wordml" xmlns:w16cex="http://schemas.microsoft.com/office/word/2018/wordml/cex" xmlns:w16cid="http://schemas.microsoft.com/office/word/2016/wordml/cid" xmlns:w16="http://schemas.microsoft.com/office/word/2018/wordml" xmlns:w16sdtdh="http://schemas.microsoft.com/office/word/2020/wordml/sdtdatahash" xmlns:w16se="http://schemas.microsoft.com/office/word/2015/wordml/symex" xmlns:wpg="http://schemas.microsoft.com/office/word/2010/wordprocessingGroup" xmlns:wpi="http://schemas.microsoft.com/office/word/2010/wordprocessingInk" xmlns:wne="http://schemas.microsoft.com/office/word/2006/wordml" xmlns:wps="http://schemas.microsoft.com/office/word/2010/wordprocessingShape" mc:Ignorable="w14 w15 w16se w16cid w16 w16cex w16sdtdh wp14">
+  <w:abstractNum w:abstractNumId="0" w15:restartNumberingAfterBreak="0">
+    <w:nsid w:val="17B7775B"/>
+    <w:multiLevelType w:val="hybridMultilevel"/>
+    <w:tmpl w:val="5E9867E4"/>
+    <w:lvl w:ilvl="0" w:tplc="04090001">
+      <w:start w:val="1"/>
+      <w:numFmt w:val="bullet"/>
+      <w:lvlText w:val=""/>
+      <w:lvlJc w:val="left"/>
+      <w:pPr>
+        <w:ind w:left="720" w:hanging="360"/>
+      </w:pPr>
+      <w:rPr>
+        <w:rFonts w:ascii="Symbol" w:hAnsi="Symbol" w:hint="default"/>
+      </w:rPr>
+    </w:lvl>
+    <w:lvl w:ilvl="1" w:tplc="04090003" w:tentative="1">
+      <w:start w:val="1"/>
+      <w:numFmt w:val="bullet"/>
+      <w:lvlText w:val="o"/>
+      <w:lvlJc w:val="left"/>
+      <w:pPr>
+        <w:ind w:left="1440" w:hanging="360"/>
+      </w:pPr>
+      <w:rPr>
+        <w:rFonts w:ascii="Courier New" w:hAnsi="Courier New" w:cs="Courier New" w:hint="default"/>
+      </w:rPr>
+    </w:lvl>
+    <w:lvl w:ilvl="2" w:tplc="04090005" w:tentative="1">
+      <w:start w:val="1"/>
+      <w:numFmt w:val="bullet"/>
+      <w:lvlText w:val=""/>
+      <w:lvlJc w:val="left"/>
+      <w:pPr>
+        <w:ind w:left="2160" w:hanging="360"/>
+      </w:pPr>
+      <w:rPr>
+        <w:rFonts w:ascii="Wingdings" w:hAnsi="Wingdings" w:hint="default"/>
+      </w:rPr>
+    </w:lvl>
+    <w:lvl w:ilvl="3" w:tplc="04090001" w:tentative="1">
+      <w:start w:val="1"/>
+      <w:numFmt w:val="bullet"/>
+      <w:lvlText w:val=""/>
+      <w:lvlJc w:val="left"/>
+      <w:pPr>
+        <w:ind w:left="2880" w:hanging="360"/>
+      </w:pPr>
+      <w:rPr>
+        <w:rFonts w:ascii="Symbol" w:hAnsi="Symbol" w:hint="default"/>
+      </w:rPr>
+    </w:lvl>
+    <w:lvl w:ilvl="4" w:tplc="04090003" w:tentative="1">
+      <w:start w:val="1"/>
+      <w:numFmt w:val="bullet"/>
+      <w:lvlText w:val="o"/>
+      <w:lvlJc w:val="left"/>
+      <w:pPr>
+        <w:ind w:left="3600" w:hanging="360"/>
+      </w:pPr>
+      <w:rPr>
+        <w:rFonts w:ascii="Courier New" w:hAnsi="Courier New" w:cs="Courier New" w:hint="default"/>
+      </w:rPr>
+    </w:lvl>
+    <w:lvl w:ilvl="5" w:tplc="04090005" w:tentative="1">
+      <w:start w:val="1"/>
+      <w:numFmt w:val="bullet"/>
+      <w:lvlText w:val=""/>
+      <w:lvlJc w:val="left"/>
+      <w:pPr>
+        <w:ind w:left="4320" w:hanging="360"/>
+      </w:pPr>
+      <w:rPr>
+        <w:rFonts w:ascii="Wingdings" w:hAnsi="Wingdings" w:hint="default"/>
+      </w:rPr>
+    </w:lvl>
+    <w:lvl w:ilvl="6" w:tplc="04090001" w:tentative="1">
+      <w:start w:val="1"/>
+      <w:numFmt w:val="bullet"/>
+      <w:lvlText w:val=""/>
+      <w:lvlJc w:val="left"/>
+      <w:pPr>
+        <w:ind w:left="5040" w:hanging="360"/>
+      </w:pPr>
+      <w:rPr>
+        <w:rFonts w:ascii="Symbol" w:hAnsi="Symbol" w:hint="default"/>
+      </w:rPr>
+    </w:lvl>
+    <w:lvl w:ilvl="7" w:tplc="04090003" w:tentative="1">
+      <w:start w:val="1"/>
+      <w:numFmt w:val="bullet"/>
+      <w:lvlText w:val="o"/>
+      <w:lvlJc w:val="left"/>
+      <w:pPr>
+        <w:ind w:left="5760" w:hanging="360"/>
+      </w:pPr>
+      <w:rPr>
+        <w:rFonts w:ascii="Courier New" w:hAnsi="Courier New" w:cs="Courier New" w:hint="default"/>
+      </w:rPr>
+    </w:lvl>
+    <w:lvl w:ilvl="8" w:tplc="04090005" w:tentative="1">
+      <w:start w:val="1"/>
+      <w:numFmt w:val="bullet"/>
+      <w:lvlText w:val=""/>
+      <w:lvlJc w:val="left"/>
+      <w:pPr>
+        <w:ind w:left="6480" w:hanging="360"/>
+      </w:pPr>
+      <w:rPr>
+        <w:rFonts w:ascii="Wingdings" w:hAnsi="Wingdings" w:hint="default"/>
+      </w:rPr>
+    </w:lvl>
+  </w:abstractNum>
+  <w:abstractNum w:abstractNumId="1" w15:restartNumberingAfterBreak="0">
+    <w:nsid w:val="7F5B0CC2"/>
+    <w:multiLevelType w:val="hybridMultilevel"/>
+    <w:tmpl w:val="48E29C8A"/>
+    <w:lvl w:ilvl="0" w:tplc="04090001">
+      <w:start w:val="1"/>
+      <w:numFmt w:val="bullet"/>
+      <w:lvlText w:val=""/>
+      <w:lvlJc w:val="left"/>
+      <w:pPr>
+        <w:ind w:left="720" w:hanging="360"/>
+      </w:pPr>
+      <w:rPr>
+        <w:rFonts w:ascii="Symbol" w:hAnsi="Symbol" w:hint="default"/>
+      </w:rPr>
+    </w:lvl>
+    <w:lvl w:ilvl="1" w:tplc="04090003" w:tentative="1">
+      <w:start w:val="1"/>
+      <w:numFmt w:val="bullet"/>
+      <w:lvlText w:val="o"/>
+      <w:lvlJc w:val="left"/>
+      <w:pPr>
+        <w:ind w:left="1440" w:hanging="360"/>
+      </w:pPr>
+      <w:rPr>
+        <w:rFonts w:ascii="Courier New" w:hAnsi="Courier New" w:cs="Courier New" w:hint="default"/>
+      </w:rPr>
+    </w:lvl>
+    <w:lvl w:ilvl="2" w:tplc="04090005" w:tentative="1">
+      <w:start w:val="1"/>
+      <w:numFmt w:val="bullet"/>
+      <w:lvlText w:val=""/>
+      <w:lvlJc w:val="left"/>
+      <w:pPr>
+        <w:ind w:left="2160" w:hanging="360"/>
+      </w:pPr>
+      <w:rPr>
+        <w:rFonts w:ascii="Wingdings" w:hAnsi="Wingdings" w:hint="default"/>
+      </w:rPr>
+    </w:lvl>
+    <w:lvl w:ilvl="3" w:tplc="04090001" w:tentative="1">
+      <w:start w:val="1"/>
+      <w:numFmt w:val="bullet"/>
+      <w:lvlText w:val=""/>
+      <w:lvlJc w:val="left"/>
+      <w:pPr>
+        <w:ind w:left="2880" w:hanging="360"/>
+      </w:pPr>
+      <w:rPr>
+        <w:rFonts w:ascii="Symbol" w:hAnsi="Symbol" w:hint="default"/>
+      </w:rPr>
+    </w:lvl>
+    <w:lvl w:ilvl="4" w:tplc="04090003" w:tentative="1">
+      <w:start w:val="1"/>
+      <w:numFmt w:val="bullet"/>
+      <w:lvlText w:val="o"/>
+      <w:lvlJc w:val="left"/>
+      <w:pPr>
+        <w:ind w:left="3600" w:hanging="360"/>
+      </w:pPr>
+      <w:rPr>
+        <w:rFonts w:ascii="Courier New" w:hAnsi="Courier New" w:cs="Courier New" w:hint="default"/>
+      </w:rPr>
+    </w:lvl>
+    <w:lvl w:ilvl="5" w:tplc="04090005" w:tentative="1">
+      <w:start w:val="1"/>
+      <w:numFmt w:val="bullet"/>
+      <w:lvlText w:val=""/>
+      <w:lvlJc w:val="left"/>
+      <w:pPr>
+        <w:ind w:left="4320" w:hanging="360"/>
+      </w:pPr>
+      <w:rPr>
+        <w:rFonts w:ascii="Wingdings" w:hAnsi="Wingdings" w:hint="default"/>
+      </w:rPr>
+    </w:lvl>
+    <w:lvl w:ilvl="6" w:tplc="04090001" w:tentative="1">
+      <w:start w:val="1"/>
+      <w:numFmt w:val="bullet"/>
+      <w:lvlText w:val=""/>
+      <w:lvlJc w:val="left"/>
+      <w:pPr>
+        <w:ind w:left="5040" w:hanging="360"/>
+      </w:pPr>
+      <w:rPr>
+        <w:rFonts w:ascii="Symbol" w:hAnsi="Symbol" w:hint="default"/>
+      </w:rPr>
+    </w:lvl>
+    <w:lvl w:ilvl="7" w:tplc="04090003" w:tentative="1">
+      <w:start w:val="1"/>
+      <w:numFmt w:val="bullet"/>
+      <w:lvlText w:val="o"/>
+      <w:lvlJc w:val="left"/>
+      <w:pPr>
+        <w:ind w:left="5760" w:hanging="360"/>
+      </w:pPr>
+      <w:rPr>
+        <w:rFonts w:ascii="Courier New" w:hAnsi="Courier New" w:cs="Courier New" w:hint="default"/>
+      </w:rPr>
+    </w:lvl>
+    <w:lvl w:ilvl="8" w:tplc="04090005" w:tentative="1">
+      <w:start w:val="1"/>
+      <w:numFmt w:val="bullet"/>
+      <w:lvlText w:val=""/>
+      <w:lvlJc w:val="left"/>
+      <w:pPr>
+        <w:ind w:left="6480" w:hanging="360"/>
+      </w:pPr>
+      <w:rPr>
+        <w:rFonts w:ascii="Wingdings" w:hAnsi="Wingdings" w:hint="default"/>
+      </w:rPr>
+    </w:lvl>
+  </w:abstractNum>
+  <w:num w:numId="1">
+    <w:abstractNumId w:val="0"/>
+  </w:num>
+  <w:num w:numId="2">
+    <w:abstractNumId w:val="1"/>
+  </w:num>
+</w:numbering>
 </file>
 
 <file path=word/styles.xml><?xml version="1.0" encoding="utf-8"?>
@@ -412,6 +2545,49 @@
     <w:name w:val="Normal"/>
     <w:qFormat/>
   </w:style>
+  <w:style w:type="paragraph" w:styleId="Heading1">
+    <w:name w:val="heading 1"/>
+    <w:basedOn w:val="Normal"/>
+    <w:next w:val="Normal"/>
+    <w:link w:val="Heading1Char"/>
+    <w:uiPriority w:val="9"/>
+    <w:qFormat/>
+    <w:rsid w:val="005C7EB1"/>
+    <w:pPr>
+      <w:keepNext/>
+      <w:keepLines/>
+      <w:spacing w:before="240" w:after="0"/>
+      <w:outlineLvl w:val="0"/>
+    </w:pPr>
+    <w:rPr>
+      <w:rFonts w:asciiTheme="majorHAnsi" w:eastAsiaTheme="majorEastAsia" w:hAnsiTheme="majorHAnsi" w:cstheme="majorBidi"/>
+      <w:color w:val="2F5496" w:themeColor="accent1" w:themeShade="BF"/>
+      <w:sz w:val="32"/>
+      <w:szCs w:val="32"/>
+    </w:rPr>
+  </w:style>
+  <w:style w:type="paragraph" w:styleId="Heading2">
+    <w:name w:val="heading 2"/>
+    <w:basedOn w:val="Normal"/>
+    <w:next w:val="Normal"/>
+    <w:link w:val="Heading2Char"/>
+    <w:uiPriority w:val="9"/>
+    <w:unhideWhenUsed/>
+    <w:qFormat/>
+    <w:rsid w:val="005C7EB1"/>
+    <w:pPr>
+      <w:keepNext/>
+      <w:keepLines/>
+      <w:spacing w:before="40" w:after="0"/>
+      <w:outlineLvl w:val="1"/>
+    </w:pPr>
+    <w:rPr>
+      <w:rFonts w:asciiTheme="majorHAnsi" w:eastAsiaTheme="majorEastAsia" w:hAnsiTheme="majorHAnsi" w:cstheme="majorBidi"/>
+      <w:color w:val="2F5496" w:themeColor="accent1" w:themeShade="BF"/>
+      <w:sz w:val="26"/>
+      <w:szCs w:val="26"/>
+    </w:rPr>
+  </w:style>
   <w:style w:type="character" w:default="1" w:styleId="DefaultParagraphFont">
     <w:name w:val="Default Paragraph Font"/>
     <w:uiPriority w:val="1"/>
@@ -438,6 +2614,43 @@
     <w:uiPriority w:val="99"/>
     <w:semiHidden/>
     <w:unhideWhenUsed/>
+  </w:style>
+  <w:style w:type="character" w:customStyle="1" w:styleId="Heading1Char">
+    <w:name w:val="Heading 1 Char"/>
+    <w:basedOn w:val="DefaultParagraphFont"/>
+    <w:link w:val="Heading1"/>
+    <w:uiPriority w:val="9"/>
+    <w:rsid w:val="005C7EB1"/>
+    <w:rPr>
+      <w:rFonts w:asciiTheme="majorHAnsi" w:eastAsiaTheme="majorEastAsia" w:hAnsiTheme="majorHAnsi" w:cstheme="majorBidi"/>
+      <w:color w:val="2F5496" w:themeColor="accent1" w:themeShade="BF"/>
+      <w:sz w:val="32"/>
+      <w:szCs w:val="32"/>
+    </w:rPr>
+  </w:style>
+  <w:style w:type="character" w:customStyle="1" w:styleId="Heading2Char">
+    <w:name w:val="Heading 2 Char"/>
+    <w:basedOn w:val="DefaultParagraphFont"/>
+    <w:link w:val="Heading2"/>
+    <w:uiPriority w:val="9"/>
+    <w:rsid w:val="005C7EB1"/>
+    <w:rPr>
+      <w:rFonts w:asciiTheme="majorHAnsi" w:eastAsiaTheme="majorEastAsia" w:hAnsiTheme="majorHAnsi" w:cstheme="majorBidi"/>
+      <w:color w:val="2F5496" w:themeColor="accent1" w:themeShade="BF"/>
+      <w:sz w:val="26"/>
+      <w:szCs w:val="26"/>
+    </w:rPr>
+  </w:style>
+  <w:style w:type="paragraph" w:styleId="ListParagraph">
+    <w:name w:val="List Paragraph"/>
+    <w:basedOn w:val="Normal"/>
+    <w:uiPriority w:val="34"/>
+    <w:qFormat/>
+    <w:rsid w:val="00DA64FB"/>
+    <w:pPr>
+      <w:ind w:left="720"/>
+      <w:contextualSpacing/>
+    </w:pPr>
   </w:style>
 </w:styles>
 </file>
@@ -735,4 +2948,16 @@
     </a:ext>
   </a:extLst>
 </a:theme>
+</file>
+
+<file path=customXml/item1.xml><?xml version="1.0" encoding="utf-8"?>
+<b:Sources xmlns:b="http://schemas.openxmlformats.org/officeDocument/2006/bibliography" xmlns="http://schemas.openxmlformats.org/officeDocument/2006/bibliography" SelectedStyle="\APASixthEditionOfficeOnline.xsl" StyleName="APA" Version="6"/>
+</file>
+
+<file path=customXml/itemProps1.xml><?xml version="1.0" encoding="utf-8"?>
+<ds:datastoreItem xmlns:ds="http://schemas.openxmlformats.org/officeDocument/2006/customXml" ds:itemID="{E040AF0A-43AE-4F5B-8C20-0CAE8F54F2A1}">
+  <ds:schemaRefs>
+    <ds:schemaRef ds:uri="http://schemas.openxmlformats.org/officeDocument/2006/bibliography"/>
+  </ds:schemaRefs>
+</ds:datastoreItem>
 </file>
</xml_diff>